<commit_message>
[reporting][subdocs]Improved templates, comment #639
</commit_message>
<xml_diff>
--- a/reporting/subdocs_templates/table_of_evolution_security_objectives_by_domain_template.docx
+++ b/reporting/subdocs_templates/table_of_evolution_security_objectives_by_domain_template.docx
@@ -126,7 +126,6 @@
               <w:t xml:space="preserve"> for year in </w:t>
             </w:r>
             <w:proofErr w:type="spellStart"/>
-            <w:proofErr w:type="gramStart"/>
             <w:r>
               <w:rPr>
                 <w:b/>
@@ -136,7 +135,6 @@
               <w:t>table.years</w:t>
             </w:r>
             <w:proofErr w:type="spellEnd"/>
-            <w:proofErr w:type="gramEnd"/>
             <w:r>
               <w:rPr>
                 <w:b/>
@@ -284,7 +282,6 @@
                 <w:lang w:val="en-US"/>
               </w:rPr>
             </w:pPr>
-            <w:proofErr w:type="gramStart"/>
             <w:r>
               <w:rPr>
                 <w:b/>
@@ -299,50 +296,23 @@
                 <w:bCs/>
                 <w:lang w:val="en-US"/>
               </w:rPr>
-              <w:t>translations</w:t>
-            </w:r>
-            <w:proofErr w:type="gramEnd"/>
-            <w:r>
-              <w:rPr>
-                <w:b/>
-                <w:bCs/>
-                <w:lang w:val="en-US"/>
-              </w:rPr>
-              <w:t>. sector_average</w:t>
-            </w:r>
-            <w:r>
-              <w:rPr>
-                <w:b/>
-                <w:bCs/>
-                <w:lang w:val="en-US"/>
-              </w:rPr>
-              <w:t>|</w:t>
-            </w:r>
-            <w:proofErr w:type="gramStart"/>
-            <w:r>
-              <w:rPr>
-                <w:b/>
-                <w:bCs/>
-                <w:lang w:val="en-US"/>
-              </w:rPr>
-              <w:t>upper</w:t>
-            </w:r>
-            <w:r>
-              <w:rPr>
-                <w:b/>
-                <w:bCs/>
-                <w:lang w:val="en-US"/>
-              </w:rPr>
-              <w:t xml:space="preserve"> }</w:t>
-            </w:r>
-            <w:proofErr w:type="gramEnd"/>
-            <w:r>
-              <w:rPr>
-                <w:b/>
-                <w:bCs/>
-                <w:lang w:val="en-US"/>
-              </w:rPr>
-              <w:t>}</w:t>
+              <w:t>translations. sector_average</w:t>
+            </w:r>
+            <w:r>
+              <w:rPr>
+                <w:b/>
+                <w:bCs/>
+                <w:lang w:val="en-US"/>
+              </w:rPr>
+              <w:t>|upper</w:t>
+            </w:r>
+            <w:r>
+              <w:rPr>
+                <w:b/>
+                <w:bCs/>
+                <w:lang w:val="en-US"/>
+              </w:rPr>
+              <w:t xml:space="preserve"> }}</w:t>
             </w:r>
             <w:r>
               <w:rPr>
@@ -427,33 +397,6 @@
             <w:tcW w:w="1500" w:type="pct"/>
             <w:tcBorders>
               <w:top w:val="nil"/>
-              <w:bottom w:val="single" w:sz="8" w:space="0" w:color="auto"/>
-              <w:right w:val="single" w:sz="8" w:space="0" w:color="auto"/>
-            </w:tcBorders>
-            <w:noWrap/>
-            <w:vAlign w:val="center"/>
-          </w:tcPr>
-          <w:p>
-            <w:pPr>
-              <w:pStyle w:val="NoSpacing"/>
-            </w:pPr>
-            <w:r>
-              <w:t xml:space="preserve">{{ </w:t>
-            </w:r>
-            <w:r>
-              <w:t>row.</w:t>
-            </w:r>
-            <w:r>
-              <w:t>domain }}</w:t>
-            </w:r>
-          </w:p>
-        </w:tc>
-        <w:tc>
-          <w:tcPr>
-            <w:tcW w:w="500" w:type="pct"/>
-            <w:tcBorders>
-              <w:top w:val="nil"/>
-              <w:left w:val="nil"/>
               <w:bottom w:val="single" w:sz="4" w:space="0" w:color="auto"/>
               <w:right w:val="single" w:sz="4" w:space="0" w:color="auto"/>
             </w:tcBorders>
@@ -463,11 +406,41 @@
           <w:p>
             <w:pPr>
               <w:pStyle w:val="NoSpacing"/>
-              <w:rPr>
-                <w:lang w:val="en-US"/>
-              </w:rPr>
             </w:pPr>
             <w:r>
+              <w:t xml:space="preserve">{{ </w:t>
+            </w:r>
+            <w:r>
+              <w:t>row.</w:t>
+            </w:r>
+            <w:r>
+              <w:t>label</w:t>
+            </w:r>
+            <w:r>
+              <w:t xml:space="preserve"> }}</w:t>
+            </w:r>
+          </w:p>
+        </w:tc>
+        <w:tc>
+          <w:tcPr>
+            <w:tcW w:w="500" w:type="pct"/>
+            <w:tcBorders>
+              <w:top w:val="nil"/>
+              <w:left w:val="single" w:sz="4" w:space="0" w:color="auto"/>
+              <w:bottom w:val="single" w:sz="4" w:space="0" w:color="auto"/>
+              <w:right w:val="single" w:sz="4" w:space="0" w:color="auto"/>
+            </w:tcBorders>
+            <w:noWrap/>
+            <w:vAlign w:val="center"/>
+          </w:tcPr>
+          <w:p>
+            <w:pPr>
+              <w:pStyle w:val="NoSpacing"/>
+              <w:rPr>
+                <w:lang w:val="en-US"/>
+              </w:rPr>
+            </w:pPr>
+            <w:r>
               <w:rPr>
                 <w:lang w:val="en-US"/>
               </w:rPr>
@@ -500,7 +473,6 @@
               <w:t xml:space="preserve"> in </w:t>
             </w:r>
             <w:proofErr w:type="spellStart"/>
-            <w:proofErr w:type="gramStart"/>
             <w:r>
               <w:rPr>
                 <w:lang w:val="en-US"/>
@@ -514,7 +486,6 @@
               <w:t>years</w:t>
             </w:r>
             <w:proofErr w:type="spellEnd"/>
-            <w:proofErr w:type="gramEnd"/>
             <w:r>
               <w:rPr>
                 <w:lang w:val="en-US"/>
@@ -551,7 +522,6 @@
               <w:t xml:space="preserve">{% if </w:t>
             </w:r>
             <w:proofErr w:type="spellStart"/>
-            <w:proofErr w:type="gramStart"/>
             <w:r>
               <w:rPr>
                 <w:lang w:val="en-US"/>
@@ -559,7 +529,6 @@
               <w:t>y.color</w:t>
             </w:r>
             <w:proofErr w:type="spellEnd"/>
-            <w:proofErr w:type="gramEnd"/>
             <w:r>
               <w:rPr>
                 <w:lang w:val="en-US"/>
@@ -667,7 +636,6 @@
               <w:t xml:space="preserve">evo in </w:t>
             </w:r>
             <w:proofErr w:type="spellStart"/>
-            <w:proofErr w:type="gramStart"/>
             <w:r>
               <w:rPr>
                 <w:lang w:val="en-US"/>
@@ -681,7 +649,6 @@
               <w:t>ow.evolution</w:t>
             </w:r>
             <w:proofErr w:type="spellEnd"/>
-            <w:proofErr w:type="gramEnd"/>
             <w:r>
               <w:rPr>
                 <w:lang w:val="en-US"/>
@@ -852,7 +819,6 @@
               <w:pStyle w:val="NoSpacing"/>
               <w:jc w:val="right"/>
             </w:pPr>
-            <w:proofErr w:type="gramStart"/>
             <w:r>
               <w:rPr>
                 <w:lang w:val="en-US"/>
@@ -864,14 +830,7 @@
               <w:rPr>
                 <w:lang w:val="en-US"/>
               </w:rPr>
-              <w:t>row</w:t>
-            </w:r>
-            <w:proofErr w:type="gramEnd"/>
-            <w:r>
-              <w:rPr>
-                <w:lang w:val="en-US"/>
-              </w:rPr>
-              <w:t>.last_avg</w:t>
+              <w:t>row.last_avg</w:t>
             </w:r>
             <w:proofErr w:type="spellEnd"/>
             <w:r>

</xml_diff>

<commit_message>
[reporting][subdocs]Enhanced table_of_evolution_security_objectives_by_domain_template, comment #639
</commit_message>
<xml_diff>
--- a/reporting/subdocs_templates/table_of_evolution_security_objectives_by_domain_template.docx
+++ b/reporting/subdocs_templates/table_of_evolution_security_objectives_by_domain_template.docx
@@ -26,7 +26,7 @@
             <w:tcBorders>
               <w:top w:val="single" w:sz="12" w:space="0" w:color="auto"/>
               <w:left w:val="single" w:sz="4" w:space="0" w:color="FFFFFF" w:themeColor="background1"/>
-              <w:bottom w:val="single" w:sz="8" w:space="0" w:color="auto"/>
+              <w:bottom w:val="single" w:sz="12" w:space="0" w:color="auto"/>
               <w:right w:val="single" w:sz="4" w:space="0" w:color="A6A6A6" w:themeColor="background1" w:themeShade="A6"/>
             </w:tcBorders>
             <w:noWrap/>
@@ -84,7 +84,7 @@
             <w:tcBorders>
               <w:top w:val="single" w:sz="12" w:space="0" w:color="auto"/>
               <w:left w:val="single" w:sz="4" w:space="0" w:color="A6A6A6" w:themeColor="background1" w:themeShade="A6"/>
-              <w:bottom w:val="single" w:sz="8" w:space="0" w:color="auto"/>
+              <w:bottom w:val="single" w:sz="12" w:space="0" w:color="auto"/>
               <w:right w:val="single" w:sz="4" w:space="0" w:color="A6A6A6" w:themeColor="background1" w:themeShade="A6"/>
             </w:tcBorders>
             <w:noWrap/>
@@ -154,7 +154,7 @@
             <w:tcBorders>
               <w:top w:val="single" w:sz="12" w:space="0" w:color="auto"/>
               <w:left w:val="single" w:sz="4" w:space="0" w:color="A6A6A6" w:themeColor="background1" w:themeShade="A6"/>
-              <w:bottom w:val="single" w:sz="8" w:space="0" w:color="auto"/>
+              <w:bottom w:val="single" w:sz="12" w:space="0" w:color="auto"/>
               <w:right w:val="single" w:sz="4" w:space="0" w:color="A6A6A6" w:themeColor="background1" w:themeShade="A6"/>
             </w:tcBorders>
             <w:noWrap/>
@@ -185,7 +185,7 @@
             <w:tcBorders>
               <w:top w:val="single" w:sz="12" w:space="0" w:color="auto"/>
               <w:left w:val="single" w:sz="4" w:space="0" w:color="A6A6A6" w:themeColor="background1" w:themeShade="A6"/>
-              <w:bottom w:val="single" w:sz="8" w:space="0" w:color="auto"/>
+              <w:bottom w:val="single" w:sz="12" w:space="0" w:color="auto"/>
               <w:right w:val="single" w:sz="4" w:space="0" w:color="A6A6A6" w:themeColor="background1" w:themeShade="A6"/>
             </w:tcBorders>
           </w:tcPr>
@@ -212,7 +212,7 @@
             <w:tcBorders>
               <w:top w:val="single" w:sz="12" w:space="0" w:color="auto"/>
               <w:left w:val="single" w:sz="4" w:space="0" w:color="A6A6A6" w:themeColor="background1" w:themeShade="A6"/>
-              <w:bottom w:val="single" w:sz="8" w:space="0" w:color="auto"/>
+              <w:bottom w:val="single" w:sz="12" w:space="0" w:color="auto"/>
               <w:right w:val="single" w:sz="4" w:space="0" w:color="A6A6A6" w:themeColor="background1" w:themeShade="A6"/>
             </w:tcBorders>
             <w:vAlign w:val="center"/>
@@ -269,7 +269,7 @@
             <w:tcBorders>
               <w:top w:val="single" w:sz="12" w:space="0" w:color="auto"/>
               <w:left w:val="single" w:sz="4" w:space="0" w:color="A6A6A6" w:themeColor="background1" w:themeShade="A6"/>
-              <w:bottom w:val="single" w:sz="8" w:space="0" w:color="auto"/>
+              <w:bottom w:val="single" w:sz="12" w:space="0" w:color="auto"/>
               <w:right w:val="single" w:sz="4" w:space="0" w:color="FFFFFF" w:themeColor="background1"/>
             </w:tcBorders>
             <w:noWrap/>
@@ -310,7 +310,16 @@
                 <w:bCs/>
                 <w:lang w:val="en-US"/>
               </w:rPr>
-              <w:t>. sector_average</w:t>
+              <w:t xml:space="preserve">. </w:t>
+            </w:r>
+            <w:proofErr w:type="spellStart"/>
+            <w:r>
+              <w:rPr>
+                <w:b/>
+                <w:bCs/>
+                <w:lang w:val="en-US"/>
+              </w:rPr>
+              <w:t>sector_average</w:t>
             </w:r>
             <w:r>
               <w:rPr>
@@ -329,6 +338,7 @@
               </w:rPr>
               <w:t>upper</w:t>
             </w:r>
+            <w:proofErr w:type="spellEnd"/>
             <w:r>
               <w:rPr>
                 <w:b/>
@@ -374,7 +384,7 @@
             <w:tcW w:w="1000" w:type="pct"/>
             <w:gridSpan w:val="6"/>
             <w:tcBorders>
-              <w:top w:val="single" w:sz="4" w:space="0" w:color="A6A6A6" w:themeColor="background1" w:themeShade="A6"/>
+              <w:top w:val="single" w:sz="12" w:space="0" w:color="auto"/>
               <w:left w:val="single" w:sz="4" w:space="0" w:color="FFFFFF" w:themeColor="background1"/>
               <w:bottom w:val="single" w:sz="4" w:space="0" w:color="A6A6A6" w:themeColor="background1" w:themeShade="A6"/>
               <w:right w:val="single" w:sz="4" w:space="0" w:color="FFFFFF" w:themeColor="background1"/>

</xml_diff>